<commit_message>
Heat Wave Driver Code
</commit_message>
<xml_diff>
--- a/JaggerAlexanderCV.docx
+++ b/JaggerAlexanderCV.docx
@@ -1150,10 +1150,19 @@
             <w:r>
               <w:rPr>
                 <w:rFonts w:ascii="Georgia" w:eastAsia="Georgia" w:hAnsi="Georgia" w:cs="Georgia"/>
-                <w:sz w:val="22"/>
-                <w:szCs w:val="22"/>
-              </w:rPr>
-              <w:t>Global Systems Laboratory, NOAA, Boulder, CO</w:t>
+                <w:bCs/>
+                <w:sz w:val="22"/>
+                <w:szCs w:val="22"/>
+              </w:rPr>
+              <w:t xml:space="preserve">NOAA </w:t>
+            </w:r>
+            <w:r>
+              <w:rPr>
+                <w:rFonts w:ascii="Georgia" w:eastAsia="Georgia" w:hAnsi="Georgia" w:cs="Georgia"/>
+                <w:sz w:val="22"/>
+                <w:szCs w:val="22"/>
+              </w:rPr>
+              <w:t>Global Systems Laboratory, Boulder, CO</w:t>
             </w:r>
           </w:p>
           <w:p>
@@ -1906,7 +1915,7 @@
       </w:tblGrid>
       <w:tr>
         <w:trPr>
-          <w:trHeight w:val="1278"/>
+          <w:trHeight w:val="999"/>
         </w:trPr>
         <w:tc>
           <w:tcPr>
@@ -2061,25 +2070,7 @@
                 <w:sz w:val="22"/>
                 <w:szCs w:val="22"/>
               </w:rPr>
-              <w:t xml:space="preserve"> relevant monthly </w:t>
-            </w:r>
-            <w:proofErr w:type="gramStart"/>
-            <w:r>
-              <w:rPr>
-                <w:rFonts w:ascii="Georgia" w:eastAsia="Georgia" w:hAnsi="Georgia" w:cs="Georgia"/>
-                <w:sz w:val="22"/>
-                <w:szCs w:val="22"/>
-              </w:rPr>
-              <w:t>trainings</w:t>
-            </w:r>
-            <w:proofErr w:type="gramEnd"/>
-            <w:r>
-              <w:rPr>
-                <w:rFonts w:ascii="Georgia" w:eastAsia="Georgia" w:hAnsi="Georgia" w:cs="Georgia"/>
-                <w:sz w:val="22"/>
-                <w:szCs w:val="22"/>
-              </w:rPr>
-              <w:t xml:space="preserve"> and participat</w:t>
+              <w:t xml:space="preserve"> relevant monthly trainings and participat</w:t>
             </w:r>
             <w:r>
               <w:rPr>
@@ -2097,23 +2088,12 @@
               </w:rPr>
               <w:t xml:space="preserve"> in general meetings </w:t>
             </w:r>
-          </w:p>
-          <w:p>
-            <w:pPr>
-              <w:pStyle w:val="ListParagraph"/>
-              <w:rPr>
-                <w:rFonts w:ascii="Georgia" w:eastAsia="Georgia" w:hAnsi="Georgia" w:cs="Georgia"/>
-                <w:bCs/>
-                <w:sz w:val="22"/>
-                <w:szCs w:val="22"/>
-              </w:rPr>
-            </w:pPr>
           </w:p>
         </w:tc>
       </w:tr>
       <w:tr>
         <w:trPr>
-          <w:trHeight w:val="1278"/>
+          <w:trHeight w:val="891"/>
         </w:trPr>
         <w:tc>
           <w:tcPr>
@@ -2213,101 +2193,6 @@
                 <w:szCs w:val="16"/>
               </w:rPr>
             </w:pPr>
-          </w:p>
-        </w:tc>
-      </w:tr>
-      <w:tr>
-        <w:trPr>
-          <w:trHeight w:val="435"/>
-        </w:trPr>
-        <w:tc>
-          <w:tcPr>
-            <w:tcW w:w="1725" w:type="dxa"/>
-            <w:tcBorders>
-              <w:top w:val="nil"/>
-              <w:left w:val="nil"/>
-              <w:bottom w:val="nil"/>
-              <w:right w:val="nil"/>
-            </w:tcBorders>
-          </w:tcPr>
-          <w:p>
-            <w:pPr>
-              <w:spacing w:line="276" w:lineRule="auto"/>
-              <w:rPr>
-                <w:rFonts w:ascii="Georgia" w:eastAsia="Georgia" w:hAnsi="Georgia" w:cs="Georgia"/>
-                <w:i/>
-                <w:sz w:val="22"/>
-                <w:szCs w:val="22"/>
-              </w:rPr>
-            </w:pPr>
-            <w:r>
-              <w:rPr>
-                <w:rFonts w:ascii="Georgia" w:eastAsia="Georgia" w:hAnsi="Georgia" w:cs="Georgia"/>
-                <w:i/>
-                <w:sz w:val="22"/>
-                <w:szCs w:val="22"/>
-              </w:rPr>
-              <w:t>Summer 2018</w:t>
-            </w:r>
-          </w:p>
-        </w:tc>
-        <w:tc>
-          <w:tcPr>
-            <w:tcW w:w="9330" w:type="dxa"/>
-            <w:tcBorders>
-              <w:top w:val="nil"/>
-              <w:left w:val="nil"/>
-              <w:bottom w:val="nil"/>
-              <w:right w:val="nil"/>
-            </w:tcBorders>
-          </w:tcPr>
-          <w:p>
-            <w:pPr>
-              <w:rPr>
-                <w:rFonts w:ascii="Georgia" w:eastAsia="Georgia" w:hAnsi="Georgia" w:cs="Georgia"/>
-                <w:sz w:val="22"/>
-                <w:szCs w:val="22"/>
-              </w:rPr>
-            </w:pPr>
-            <w:r>
-              <w:rPr>
-                <w:rFonts w:ascii="Georgia" w:eastAsia="Georgia" w:hAnsi="Georgia" w:cs="Georgia"/>
-                <w:b/>
-                <w:sz w:val="22"/>
-                <w:szCs w:val="22"/>
-              </w:rPr>
-              <w:t xml:space="preserve"> Big Blue Conservation</w:t>
-            </w:r>
-            <w:r>
-              <w:rPr>
-                <w:rFonts w:ascii="Georgia" w:eastAsia="Georgia" w:hAnsi="Georgia" w:cs="Georgia"/>
-                <w:sz w:val="22"/>
-                <w:szCs w:val="22"/>
-              </w:rPr>
-              <w:t>, Koh Tao, Thailand</w:t>
-            </w:r>
-          </w:p>
-          <w:p>
-            <w:pPr>
-              <w:numPr>
-                <w:ilvl w:val="0"/>
-                <w:numId w:val="1"/>
-              </w:numPr>
-              <w:ind w:left="360"/>
-              <w:rPr>
-                <w:rFonts w:ascii="Georgia" w:eastAsia="Georgia" w:hAnsi="Georgia" w:cs="Georgia"/>
-                <w:sz w:val="22"/>
-                <w:szCs w:val="22"/>
-              </w:rPr>
-            </w:pPr>
-            <w:r>
-              <w:rPr>
-                <w:rFonts w:ascii="Georgia" w:eastAsia="Georgia" w:hAnsi="Georgia" w:cs="Georgia"/>
-                <w:sz w:val="22"/>
-                <w:szCs w:val="22"/>
-              </w:rPr>
-              <w:t>Leveraged advanced open water diving certification to conduct marine censuses and construct artificial underwater reefs, contributing to efforts in mitigating climate change-related damage in the Gulf of Thailand</w:t>
-            </w:r>
           </w:p>
         </w:tc>
       </w:tr>
@@ -2483,15 +2368,7 @@
                 <w:sz w:val="22"/>
                 <w:szCs w:val="22"/>
               </w:rPr>
-              <w:t xml:space="preserve"> </w:t>
-            </w:r>
-            <w:r>
-              <w:rPr>
-                <w:rFonts w:ascii="Georgia" w:eastAsia="Georgia" w:hAnsi="Georgia" w:cs="Georgia"/>
-                <w:sz w:val="22"/>
-                <w:szCs w:val="22"/>
-              </w:rPr>
-              <w:t xml:space="preserve">(In review at </w:t>
+              <w:t xml:space="preserve"> (In review at </w:t>
             </w:r>
             <w:r>
               <w:rPr>
@@ -2868,7 +2745,6 @@
                 <w:sz w:val="22"/>
                 <w:szCs w:val="22"/>
               </w:rPr>
-              <w:lastRenderedPageBreak/>
               <w:t xml:space="preserve">Larisa R. G. DeSantis, </w:t>
             </w:r>
             <w:r>
@@ -3105,6 +2981,7 @@
                 <w:sz w:val="28"/>
                 <w:szCs w:val="28"/>
               </w:rPr>
+              <w:lastRenderedPageBreak/>
               <w:t>Presentations</w:t>
             </w:r>
           </w:p>
@@ -3236,6 +3113,7 @@
                 <w:sz w:val="22"/>
                 <w:szCs w:val="22"/>
               </w:rPr>
+              <w:lastRenderedPageBreak/>
               <w:t xml:space="preserve">Jagger Alexander </w:t>
             </w:r>
             <w:r>
@@ -3995,15 +3873,7 @@
                 <w:sz w:val="22"/>
                 <w:szCs w:val="22"/>
               </w:rPr>
-              <w:t>Spatial d</w:t>
-            </w:r>
-            <w:r>
-              <w:rPr>
-                <w:rFonts w:ascii="Georgia" w:eastAsia="Georgia" w:hAnsi="Georgia" w:cs="Georgia"/>
-                <w:sz w:val="22"/>
-                <w:szCs w:val="22"/>
-              </w:rPr>
-              <w:t>ata interpolation (kriging, etc.)</w:t>
+              <w:t>Spatial data interpolation (kriging, etc.)</w:t>
             </w:r>
           </w:p>
           <w:p>
@@ -6345,6 +6215,7 @@
   <w:style w:type="character" w:default="1" w:styleId="DefaultParagraphFont">
     <w:name w:val="Default Paragraph Font"/>
     <w:uiPriority w:val="1"/>
+    <w:semiHidden/>
     <w:unhideWhenUsed/>
   </w:style>
   <w:style w:type="table" w:default="1" w:styleId="TableNormal">

</xml_diff>